<commit_message>
Add Document Library to the Software Design Document
New section 5.6 (Member Document Library & Easter-Egg Documents)
covering the member library, officer Document Studio, private
storage and security model, the easter-egg treasure hunt with the
+10 Clover award, and the two printable calendars. Document Control
gains revision 1.2 dated 2026-09-19.

Co-Authored-By: Claude Fable 5 <noreply@anthropic.com>
Claude-Session: https://claude.ai/code/session_014wmj69fA9f4QJBPeBBBZBd
</commit_message>
<xml_diff>
--- a/Krewe of Shamrock - Software Design Document.docx
+++ b/Krewe of Shamrock - Software Design Document.docx
@@ -568,6 +568,147 @@
                 <w:szCs w:val="19"/>
               </w:rPr>
               <w:t xml:space="preserve">Added GitHub repository, source-control &amp; collaboration section, updated diagram, risks and roadmap</w:t>
+            </w:r>
+          </w:p>
+        </w:tc>
+      </w:tr>
+      <w:tr>
+        <w:trPr>
+          <w:tblHeader w:val="false"/>
+        </w:trPr>
+        <w:tc>
+          <w:tcPr>
+            <w:tcW w:type="dxa" w:w="1400"/>
+            <w:tcBorders>
+              <w:top w:val="single" w:color="C9C9C9" w:sz="1"/>
+              <w:left w:val="single" w:color="C9C9C9" w:sz="1"/>
+              <w:bottom w:val="single" w:color="C9C9C9" w:sz="1"/>
+              <w:right w:val="single" w:color="C9C9C9" w:sz="1"/>
+            </w:tcBorders>
+            <w:shd w:fill="F4F7F4" w:val="clear"/>
+            <w:tcMar>
+              <w:top w:type="dxa" w:w="70"/>
+              <w:left w:type="dxa" w:w="110"/>
+              <w:bottom w:type="dxa" w:w="70"/>
+              <w:right w:type="dxa" w:w="110"/>
+            </w:tcMar>
+            <w:vAlign w:val="center"/>
+          </w:tcPr>
+          <w:p>
+            <w:pPr>
+              <w:spacing w:after="0" w:line="264"/>
+            </w:pPr>
+            <w:r>
+              <w:rPr>
+                <w:b w:val="false"/>
+                <w:bCs w:val="false"/>
+                <w:color w:val="1A1A1A"/>
+                <w:sz w:val="19"/>
+                <w:szCs w:val="19"/>
+              </w:rPr>
+              <w:t xml:space="preserve">1.2</w:t>
+            </w:r>
+          </w:p>
+        </w:tc>
+        <w:tc>
+          <w:tcPr>
+            <w:tcW w:type="dxa" w:w="1500"/>
+            <w:tcBorders>
+              <w:top w:val="single" w:color="C9C9C9" w:sz="1"/>
+              <w:left w:val="single" w:color="C9C9C9" w:sz="1"/>
+              <w:bottom w:val="single" w:color="C9C9C9" w:sz="1"/>
+              <w:right w:val="single" w:color="C9C9C9" w:sz="1"/>
+            </w:tcBorders>
+            <w:shd w:fill="F4F7F4" w:val="clear"/>
+            <w:tcMar>
+              <w:top w:type="dxa" w:w="70"/>
+              <w:left w:type="dxa" w:w="110"/>
+              <w:bottom w:type="dxa" w:w="70"/>
+              <w:right w:type="dxa" w:w="110"/>
+            </w:tcMar>
+            <w:vAlign w:val="center"/>
+          </w:tcPr>
+          <w:p>
+            <w:pPr>
+              <w:spacing w:after="0" w:line="264"/>
+            </w:pPr>
+            <w:r>
+              <w:rPr>
+                <w:b w:val="false"/>
+                <w:bCs w:val="false"/>
+                <w:color w:val="1A1A1A"/>
+                <w:sz w:val="19"/>
+                <w:szCs w:val="19"/>
+              </w:rPr>
+              <w:t xml:space="preserve">2026-09-19</w:t>
+            </w:r>
+          </w:p>
+        </w:tc>
+        <w:tc>
+          <w:tcPr>
+            <w:tcW w:type="dxa" w:w="2600"/>
+            <w:tcBorders>
+              <w:top w:val="single" w:color="C9C9C9" w:sz="1"/>
+              <w:left w:val="single" w:color="C9C9C9" w:sz="1"/>
+              <w:bottom w:val="single" w:color="C9C9C9" w:sz="1"/>
+              <w:right w:val="single" w:color="C9C9C9" w:sz="1"/>
+            </w:tcBorders>
+            <w:shd w:fill="F4F7F4" w:val="clear"/>
+            <w:tcMar>
+              <w:top w:type="dxa" w:w="70"/>
+              <w:left w:type="dxa" w:w="110"/>
+              <w:bottom w:type="dxa" w:w="70"/>
+              <w:right w:type="dxa" w:w="110"/>
+            </w:tcMar>
+            <w:vAlign w:val="center"/>
+          </w:tcPr>
+          <w:p>
+            <w:pPr>
+              <w:spacing w:after="0" w:line="264"/>
+            </w:pPr>
+            <w:r>
+              <w:rPr>
+                <w:b w:val="false"/>
+                <w:bCs w:val="false"/>
+                <w:color w:val="1A1A1A"/>
+                <w:sz w:val="19"/>
+                <w:szCs w:val="19"/>
+              </w:rPr>
+              <w:t xml:space="preserve">Krewe web project (Cowork)</w:t>
+            </w:r>
+          </w:p>
+        </w:tc>
+        <w:tc>
+          <w:tcPr>
+            <w:tcW w:type="dxa" w:w="3860"/>
+            <w:tcBorders>
+              <w:top w:val="single" w:color="C9C9C9" w:sz="1"/>
+              <w:left w:val="single" w:color="C9C9C9" w:sz="1"/>
+              <w:bottom w:val="single" w:color="C9C9C9" w:sz="1"/>
+              <w:right w:val="single" w:color="C9C9C9" w:sz="1"/>
+            </w:tcBorders>
+            <w:shd w:fill="F4F7F4" w:val="clear"/>
+            <w:tcMar>
+              <w:top w:type="dxa" w:w="70"/>
+              <w:left w:type="dxa" w:w="110"/>
+              <w:bottom w:type="dxa" w:w="70"/>
+              <w:right w:type="dxa" w:w="110"/>
+            </w:tcMar>
+            <w:vAlign w:val="center"/>
+          </w:tcPr>
+          <w:p>
+            <w:pPr>
+              <w:spacing w:after="0" w:line="264"/>
+            </w:pPr>
+            <w:r>
+              <w:rPr>
+                <w:b w:val="false"/>
+                <w:bCs w:val="false"/>
+                <w:color w:val="1A1A1A"/>
+                <w:sz w:val="19"/>
+                <w:szCs w:val="19"/>
+              </w:rPr>
+              <w:t xml:space="preserve">Added section 5.6: member Document Library, officer Document Studio, easter-egg documents, and the printable Season Calendar</w:t>
             </w:r>
           </w:p>
         </w:tc>
@@ -2840,6 +2981,89 @@
       </w:pPr>
       <w:r>
         <w:t xml:space="preserve">The backend currently shares an existing Supabase project (“Tribe Test”); a dedicated project was deferred due to an unrelated billing hold.</w:t>
+      </w:r>
+    </w:p>
+    <w:p>
+      <w:pPr>
+        <w:pStyle w:val="Heading2"/>
+      </w:pPr>
+      <w:r>
+        <w:t xml:space="preserve">5.6 Member Document Library &amp; Easter-Egg Documents (added 2026-09)</w:t>
+      </w:r>
+    </w:p>
+    <w:p>
+      <w:pPr>
+        <w:spacing w:after="120" w:before="0" w:line="276"/>
+      </w:pPr>
+      <w:r>
+        <w:rPr>
+          <w:b/>
+          <w:bCs/>
+        </w:rPr>
+        <w:t xml:space="preserve">What members see: </w:t>
+      </w:r>
+      <w:r>
+        <w:t xml:space="preserve">the Documents card inside the gated Members area now lists every krewe document on category shelves — Governing (bylaws, Code of Conduct, parade rules, dues, waiver), Calendars &amp; Season, Forms, Newsletters, and a personal “Fun finds” shelf. Each document offers Open, Download, and Print actions sized for phones. Officers get a matching “Document Studio” tool on the Officer desk to upload files, edit titles and categories, publish or retire documents, and replace a file without breaking its links — no code changes involved.</w:t>
+      </w:r>
+    </w:p>
+    <w:p>
+      <w:pPr>
+        <w:spacing w:after="120" w:before="0" w:line="276"/>
+      </w:pPr>
+      <w:r>
+        <w:rPr>
+          <w:b/>
+          <w:bCs/>
+        </w:rPr>
+        <w:t xml:space="preserve">Where documents live: </w:t>
+      </w:r>
+      <w:r>
+        <w:t xml:space="preserve">document details (title, description, category, publish state) sit in a new documents table; uploaded files go in krewe-documents, the project’s first private storage bucket, so members download through short-lived signed links rather than public addresses. Row-Level Security decides visibility: members read published documents plus any easter eggs they personally found (tracked one-per-member in document_discoveries); officers read everything, and all writes go through officer-only server functions. By krewe decision, downloads are not logged in any form.</w:t>
+      </w:r>
+    </w:p>
+    <w:p>
+      <w:pPr>
+        <w:spacing w:after="120" w:before="0" w:line="276"/>
+      </w:pPr>
+      <w:r>
+        <w:rPr>
+          <w:b/>
+          <w:bCs/>
+        </w:rPr>
+        <w:t xml:space="preserve">The treasure hunt: </w:t>
+      </w:r>
+      <w:r>
+        <w:t xml:space="preserve">a few documents are hidden “easter eggs.” Small clover links tucked into the public Parades, Krewe History, and Poetry &amp; Art pages open the Members area with a secret code; the discover_document function records the find, pops a celebration, awards +10 Clovers in the Craic Cup game (first find only — a database uniqueness rule prevents repeats), and places the document on that member’s Fun finds shelf. Launch eggs: the Tampa Bay Parade Calendar, “Shamrock Lore” (founding tale and trivia), and a printable Irish Blessing card.</w:t>
+      </w:r>
+    </w:p>
+    <w:p>
+      <w:pPr>
+        <w:spacing w:after="120" w:before="0" w:line="276"/>
+      </w:pPr>
+      <w:r>
+        <w:rPr>
+          <w:b/>
+          <w:bCs/>
+        </w:rPr>
+        <w:t xml:space="preserve">The calendars: </w:t>
+      </w:r>
+      <w:r>
+        <w:t xml:space="preserve">the Tampa Bay Parade Calendar is a one-page printable listing of the Inter-Krewe Council season. The Krewe of Shamrock Season Calendar is a twelve-page printable planner — one month per page, July through June to match the krewe’s season rule — with krewe parades and events pre-printed from the events table and generous “pencil it in” space so a printed copy stays useful as new dates are announced. Both are print-styled HTML pages, so updating a date is a one-file edit rather than a re-exported PDF.</w:t>
+      </w:r>
+    </w:p>
+    <w:p>
+      <w:pPr>
+        <w:spacing w:after="120" w:before="0" w:line="276"/>
+      </w:pPr>
+      <w:r>
+        <w:rPr>
+          <w:b/>
+          <w:bCs/>
+        </w:rPr>
+        <w:t xml:space="preserve">Status &amp; references: </w:t>
+      </w:r>
+      <w:r>
+        <w:t xml:space="preserve">shipped to production 2026-09-19. This feature runs on the dedicated Krewe of Shamrock Supabase project with per-member Supabase Auth login (the shared-passcode description in section 5.3 predates that migration). Full design and build history: DOCUMENT_LIBRARY_PLAN.md and DATABASE_BACKEND.md in the GitHub repository.</w:t>
       </w:r>
     </w:p>
     <w:p>

</xml_diff>